<commit_message>
Added new endpoint to the API documentation
</commit_message>
<xml_diff>
--- a/Capstone Documentation/API Design Document - V2.docx
+++ b/Capstone Documentation/API Design Document - V2.docx
@@ -483,14 +483,30 @@
                 <w:rFonts w:ascii="Consolas" w:eastAsia="Consolas" w:hAnsi="Consolas" w:cs="Consolas"/>
                 <w:color w:val="1F2328"/>
               </w:rPr>
-              <w:t>GET http:</w:t>
+              <w:t xml:space="preserve">GET </w:t>
+            </w:r>
+            <w:proofErr w:type="gramStart"/>
+            <w:r>
+              <w:rPr>
+                <w:rFonts w:ascii="Consolas" w:eastAsia="Consolas" w:hAnsi="Consolas" w:cs="Consolas"/>
+                <w:color w:val="1F2328"/>
+              </w:rPr>
+              <w:t>http:</w:t>
             </w:r>
             <w:r>
               <w:rPr>
                 <w:rFonts w:ascii="Consolas" w:eastAsia="Consolas" w:hAnsi="Consolas" w:cs="Consolas"/>
                 <w:color w:val="6E7781"/>
               </w:rPr>
-              <w:t>//localhost:8080/api/events/status/{COMPLETED | CANCELLED | SCHEDULED}</w:t>
+              <w:t>//localhost:8080/api/events/status/{</w:t>
+            </w:r>
+            <w:proofErr w:type="gramEnd"/>
+            <w:r>
+              <w:rPr>
+                <w:rFonts w:ascii="Consolas" w:eastAsia="Consolas" w:hAnsi="Consolas" w:cs="Consolas"/>
+                <w:color w:val="6E7781"/>
+              </w:rPr>
+              <w:t>COMPLETED | CANCELLED | SCHEDULED}</w:t>
             </w:r>
           </w:p>
           <w:p>
@@ -873,8 +889,13 @@
           <w:numId w:val="5"/>
         </w:numPr>
       </w:pPr>
-      <w:r>
-        <w:t>Creates a new event</w:t>
+      <w:proofErr w:type="gramStart"/>
+      <w:r>
+        <w:t>Creates</w:t>
+      </w:r>
+      <w:proofErr w:type="gramEnd"/>
+      <w:r>
+        <w:t xml:space="preserve"> a new event</w:t>
       </w:r>
     </w:p>
     <w:p>
@@ -910,7 +931,15 @@
         </w:numPr>
       </w:pPr>
       <w:r>
-        <w:t>Returns the created event with HTTP 201 (Created)</w:t>
+        <w:t xml:space="preserve">Returns the </w:t>
+      </w:r>
+      <w:proofErr w:type="gramStart"/>
+      <w:r>
+        <w:t>created event</w:t>
+      </w:r>
+      <w:proofErr w:type="gramEnd"/>
+      <w:r>
+        <w:t xml:space="preserve"> with HTTP 201 (Created)</w:t>
       </w:r>
     </w:p>
     <w:p>
@@ -1357,9 +1386,14 @@
       <w:pPr>
         <w:pStyle w:val="Heading3"/>
       </w:pPr>
+      <w:proofErr w:type="gramStart"/>
       <w:r>
         <w:lastRenderedPageBreak/>
-        <w:t>Create a New Venue</w:t>
+        <w:t>Create</w:t>
+      </w:r>
+      <w:proofErr w:type="gramEnd"/>
+      <w:r>
+        <w:t xml:space="preserve"> a New Venue</w:t>
       </w:r>
     </w:p>
     <w:p>
@@ -1379,8 +1413,13 @@
           <w:numId w:val="10"/>
         </w:numPr>
       </w:pPr>
-      <w:r>
-        <w:t>Creates a new venue</w:t>
+      <w:proofErr w:type="gramStart"/>
+      <w:r>
+        <w:t>Creates</w:t>
+      </w:r>
+      <w:proofErr w:type="gramEnd"/>
+      <w:r>
+        <w:t xml:space="preserve"> a new venue</w:t>
       </w:r>
     </w:p>
     <w:p>
@@ -1474,7 +1513,14 @@
               <w:rPr>
                 <w:color w:val="707070"/>
               </w:rPr>
-              <w:t xml:space="preserve">1     </w:t>
+              <w:t xml:space="preserve">1  </w:t>
+            </w:r>
+            <w:proofErr w:type="gramStart"/>
+            <w:r>
+              <w:rPr>
+                <w:color w:val="707070"/>
+              </w:rPr>
+              <w:t xml:space="preserve">   </w:t>
             </w:r>
             <w:r>
               <w:rPr>
@@ -1483,6 +1529,7 @@
               </w:rPr>
               <w:t>{</w:t>
             </w:r>
+            <w:proofErr w:type="gramEnd"/>
           </w:p>
           <w:p>
             <w:pPr>
@@ -1548,12 +1595,21 @@
               <w:t>            "</w:t>
             </w:r>
             <w:proofErr w:type="spellStart"/>
-            <w:r>
-              <w:rPr>
-                <w:rFonts w:ascii="Consolas" w:eastAsia="Consolas" w:hAnsi="Consolas" w:cs="Consolas"/>
-                <w:color w:val="1F2328"/>
-              </w:rPr>
-              <w:t>venue_name</w:t>
+            <w:proofErr w:type="gramStart"/>
+            <w:r>
+              <w:rPr>
+                <w:rFonts w:ascii="Consolas" w:eastAsia="Consolas" w:hAnsi="Consolas" w:cs="Consolas"/>
+                <w:color w:val="1F2328"/>
+              </w:rPr>
+              <w:t>venue</w:t>
+            </w:r>
+            <w:proofErr w:type="gramEnd"/>
+            <w:r>
+              <w:rPr>
+                <w:rFonts w:ascii="Consolas" w:eastAsia="Consolas" w:hAnsi="Consolas" w:cs="Consolas"/>
+                <w:color w:val="1F2328"/>
+              </w:rPr>
+              <w:t>_name</w:t>
             </w:r>
             <w:proofErr w:type="spellEnd"/>
             <w:r>
@@ -1596,12 +1652,21 @@
               <w:t>            "</w:t>
             </w:r>
             <w:proofErr w:type="spellStart"/>
-            <w:r>
-              <w:rPr>
-                <w:rFonts w:ascii="Consolas" w:eastAsia="Consolas" w:hAnsi="Consolas" w:cs="Consolas"/>
-                <w:color w:val="1F2328"/>
-              </w:rPr>
-              <w:t>total_capacity</w:t>
+            <w:proofErr w:type="gramStart"/>
+            <w:r>
+              <w:rPr>
+                <w:rFonts w:ascii="Consolas" w:eastAsia="Consolas" w:hAnsi="Consolas" w:cs="Consolas"/>
+                <w:color w:val="1F2328"/>
+              </w:rPr>
+              <w:t>total</w:t>
+            </w:r>
+            <w:proofErr w:type="gramEnd"/>
+            <w:r>
+              <w:rPr>
+                <w:rFonts w:ascii="Consolas" w:eastAsia="Consolas" w:hAnsi="Consolas" w:cs="Consolas"/>
+                <w:color w:val="1F2328"/>
+              </w:rPr>
+              <w:t>_capacity</w:t>
             </w:r>
             <w:proofErr w:type="spellEnd"/>
             <w:r>
@@ -1801,8 +1866,17 @@
                 <w:rFonts w:ascii="Consolas" w:eastAsia="Consolas" w:hAnsi="Consolas" w:cs="Consolas"/>
                 <w:color w:val="1F2328"/>
               </w:rPr>
-              <w:t>    "pageable": {</w:t>
-            </w:r>
+              <w:t>    "pageable</w:t>
+            </w:r>
+            <w:proofErr w:type="gramStart"/>
+            <w:r>
+              <w:rPr>
+                <w:rFonts w:ascii="Consolas" w:eastAsia="Consolas" w:hAnsi="Consolas" w:cs="Consolas"/>
+                <w:color w:val="1F2328"/>
+              </w:rPr>
+              <w:t>": {</w:t>
+            </w:r>
+            <w:proofErr w:type="gramEnd"/>
           </w:p>
           <w:p>
             <w:pPr>
@@ -1929,8 +2003,17 @@
                 <w:rFonts w:ascii="Consolas" w:eastAsia="Consolas" w:hAnsi="Consolas" w:cs="Consolas"/>
                 <w:color w:val="1F2328"/>
               </w:rPr>
-              <w:t>        "sort": {</w:t>
-            </w:r>
+              <w:t>        "sort</w:t>
+            </w:r>
+            <w:proofErr w:type="gramStart"/>
+            <w:r>
+              <w:rPr>
+                <w:rFonts w:ascii="Consolas" w:eastAsia="Consolas" w:hAnsi="Consolas" w:cs="Consolas"/>
+                <w:color w:val="1F2328"/>
+              </w:rPr>
+              <w:t>": {</w:t>
+            </w:r>
+            <w:proofErr w:type="gramEnd"/>
           </w:p>
           <w:p>
             <w:pPr>
@@ -2107,8 +2190,17 @@
                 <w:rFonts w:ascii="Consolas" w:eastAsia="Consolas" w:hAnsi="Consolas" w:cs="Consolas"/>
                 <w:color w:val="1F2328"/>
               </w:rPr>
-              <w:t>    "sort": {</w:t>
-            </w:r>
+              <w:t>    "sort</w:t>
+            </w:r>
+            <w:proofErr w:type="gramStart"/>
+            <w:r>
+              <w:rPr>
+                <w:rFonts w:ascii="Consolas" w:eastAsia="Consolas" w:hAnsi="Consolas" w:cs="Consolas"/>
+                <w:color w:val="1F2328"/>
+              </w:rPr>
+              <w:t>": {</w:t>
+            </w:r>
+            <w:proofErr w:type="gramEnd"/>
           </w:p>
           <w:p>
             <w:pPr>
@@ -2552,7 +2644,15 @@
     </w:p>
     <w:p>
       <w:r>
-        <w:t>Example result:</w:t>
+        <w:t xml:space="preserve">Example </w:t>
+      </w:r>
+      <w:proofErr w:type="gramStart"/>
+      <w:r>
+        <w:t>result</w:t>
+      </w:r>
+      <w:proofErr w:type="gramEnd"/>
+      <w:r>
+        <w:t>:</w:t>
       </w:r>
     </w:p>
     <w:p>
@@ -2566,8 +2666,13 @@
         <w:t>    "</w:t>
       </w:r>
       <w:proofErr w:type="spellStart"/>
-      <w:r>
-        <w:t>event_id</w:t>
+      <w:proofErr w:type="gramStart"/>
+      <w:r>
+        <w:t>event</w:t>
+      </w:r>
+      <w:proofErr w:type="gramEnd"/>
+      <w:r>
+        <w:t>_id</w:t>
       </w:r>
       <w:proofErr w:type="spellEnd"/>
       <w:r>
@@ -2594,8 +2699,13 @@
         <w:t>    "</w:t>
       </w:r>
       <w:proofErr w:type="spellStart"/>
-      <w:r>
-        <w:t>total_quantity</w:t>
+      <w:proofErr w:type="gramStart"/>
+      <w:r>
+        <w:t>total</w:t>
+      </w:r>
+      <w:proofErr w:type="gramEnd"/>
+      <w:r>
+        <w:t>_quantity</w:t>
       </w:r>
       <w:proofErr w:type="spellEnd"/>
       <w:r>
@@ -2684,11 +2794,16 @@
     </w:p>
     <w:p>
       <w:r>
-        <w:t xml:space="preserve">Example result: </w:t>
+        <w:t xml:space="preserve">Example </w:t>
+      </w:r>
+      <w:proofErr w:type="gramStart"/>
+      <w:r>
+        <w:t xml:space="preserve">result: </w:t>
       </w:r>
       <w:r>
         <w:t>{</w:t>
       </w:r>
+      <w:proofErr w:type="gramEnd"/>
     </w:p>
     <w:p>
       <w:r>
@@ -2710,8 +2825,13 @@
         <w:t xml:space="preserve">            "</w:t>
       </w:r>
       <w:proofErr w:type="spellStart"/>
-      <w:r>
-        <w:t>event_id</w:t>
+      <w:proofErr w:type="gramStart"/>
+      <w:r>
+        <w:t>event</w:t>
+      </w:r>
+      <w:proofErr w:type="gramEnd"/>
+      <w:r>
+        <w:t>_id</w:t>
       </w:r>
       <w:proofErr w:type="spellEnd"/>
       <w:r>
@@ -2728,8 +2848,13 @@
         <w:t xml:space="preserve">            "</w:t>
       </w:r>
       <w:proofErr w:type="spellStart"/>
-      <w:r>
-        <w:t>total_quantity</w:t>
+      <w:proofErr w:type="gramStart"/>
+      <w:r>
+        <w:t>total</w:t>
+      </w:r>
+      <w:proofErr w:type="gramEnd"/>
+      <w:r>
+        <w:t>_quantity</w:t>
       </w:r>
       <w:proofErr w:type="spellEnd"/>
       <w:r>
@@ -2743,8 +2868,13 @@
     </w:p>
     <w:p>
       <w:r>
-        <w:t xml:space="preserve">            "event": {</w:t>
-      </w:r>
+        <w:t xml:space="preserve">            "event</w:t>
+      </w:r>
+      <w:proofErr w:type="gramStart"/>
+      <w:r>
+        <w:t>": {</w:t>
+      </w:r>
+      <w:proofErr w:type="gramEnd"/>
     </w:p>
     <w:p>
       <w:r>
@@ -2756,8 +2886,13 @@
         <w:t xml:space="preserve">                "</w:t>
       </w:r>
       <w:proofErr w:type="spellStart"/>
-      <w:r>
-        <w:t>event_name</w:t>
+      <w:proofErr w:type="gramStart"/>
+      <w:r>
+        <w:t>event</w:t>
+      </w:r>
+      <w:proofErr w:type="gramEnd"/>
+      <w:r>
+        <w:t>_name</w:t>
       </w:r>
       <w:proofErr w:type="spellEnd"/>
       <w:r>
@@ -2779,8 +2914,13 @@
         <w:t xml:space="preserve">                "</w:t>
       </w:r>
       <w:proofErr w:type="spellStart"/>
-      <w:r>
-        <w:t>total_spots</w:t>
+      <w:proofErr w:type="gramStart"/>
+      <w:r>
+        <w:t>total</w:t>
+      </w:r>
+      <w:proofErr w:type="gramEnd"/>
+      <w:r>
+        <w:t>_spots</w:t>
       </w:r>
       <w:proofErr w:type="spellEnd"/>
       <w:r>
@@ -2793,8 +2933,13 @@
         <w:t xml:space="preserve">                "</w:t>
       </w:r>
       <w:proofErr w:type="spellStart"/>
-      <w:r>
-        <w:t>venue_id</w:t>
+      <w:proofErr w:type="gramStart"/>
+      <w:r>
+        <w:t>venue</w:t>
+      </w:r>
+      <w:proofErr w:type="gramEnd"/>
+      <w:r>
+        <w:t>_id</w:t>
       </w:r>
       <w:proofErr w:type="spellEnd"/>
       <w:r>
@@ -2816,8 +2961,13 @@
     </w:p>
     <w:p>
       <w:r>
-        <w:t xml:space="preserve">                "venue": {</w:t>
-      </w:r>
+        <w:t xml:space="preserve">                "</w:t>
+      </w:r>
+      <w:proofErr w:type="gramStart"/>
+      <w:r>
+        <w:t>venue": {</w:t>
+      </w:r>
+      <w:proofErr w:type="gramEnd"/>
     </w:p>
     <w:p>
       <w:r>
@@ -2829,8 +2979,13 @@
         <w:t xml:space="preserve">                    "</w:t>
       </w:r>
       <w:proofErr w:type="spellStart"/>
-      <w:r>
-        <w:t>venue_name</w:t>
+      <w:proofErr w:type="gramStart"/>
+      <w:r>
+        <w:t>venue</w:t>
+      </w:r>
+      <w:proofErr w:type="gramEnd"/>
+      <w:r>
+        <w:t>_name</w:t>
       </w:r>
       <w:proofErr w:type="spellEnd"/>
       <w:r>
@@ -2847,8 +3002,13 @@
         <w:t xml:space="preserve">                    "</w:t>
       </w:r>
       <w:proofErr w:type="spellStart"/>
-      <w:r>
-        <w:t>total_capacity</w:t>
+      <w:proofErr w:type="gramStart"/>
+      <w:r>
+        <w:t>total</w:t>
+      </w:r>
+      <w:proofErr w:type="gramEnd"/>
+      <w:r>
+        <w:t>_capacity</w:t>
       </w:r>
       <w:proofErr w:type="spellEnd"/>
       <w:r>
@@ -2864,9 +3024,11 @@
         <w:t>hibernateLazyInitializer</w:t>
       </w:r>
       <w:proofErr w:type="spellEnd"/>
+      <w:proofErr w:type="gramStart"/>
       <w:r>
         <w:t>": {}</w:t>
       </w:r>
+      <w:proofErr w:type="gramEnd"/>
     </w:p>
     <w:p>
       <w:r>
@@ -2923,8 +3085,13 @@
     </w:p>
     <w:p>
       <w:r>
-        <w:t xml:space="preserve">    "pageable": {</w:t>
-      </w:r>
+        <w:t xml:space="preserve">    "pageable</w:t>
+      </w:r>
+      <w:proofErr w:type="gramStart"/>
+      <w:r>
+        <w:t>": {</w:t>
+      </w:r>
+      <w:proofErr w:type="gramEnd"/>
     </w:p>
     <w:p>
       <w:r>
@@ -2964,8 +3131,13 @@
     </w:p>
     <w:p>
       <w:r>
-        <w:t xml:space="preserve">        "sort": {</w:t>
-      </w:r>
+        <w:t xml:space="preserve">        "sort</w:t>
+      </w:r>
+      <w:proofErr w:type="gramStart"/>
+      <w:r>
+        <w:t>": {</w:t>
+      </w:r>
+      <w:proofErr w:type="gramEnd"/>
     </w:p>
     <w:p>
       <w:r>
@@ -3005,8 +3177,13 @@
     </w:p>
     <w:p>
       <w:r>
-        <w:t xml:space="preserve">    "sort": {</w:t>
-      </w:r>
+        <w:t xml:space="preserve">    "sort</w:t>
+      </w:r>
+      <w:proofErr w:type="gramStart"/>
+      <w:r>
+        <w:t>": {</w:t>
+      </w:r>
+      <w:proofErr w:type="gramEnd"/>
     </w:p>
     <w:p>
       <w:r>
@@ -3267,8 +3444,13 @@
       <w:pPr>
         <w:pStyle w:val="Heading3"/>
       </w:pPr>
-      <w:r>
-        <w:t>Create a New Ticket</w:t>
+      <w:proofErr w:type="gramStart"/>
+      <w:r>
+        <w:t>Create</w:t>
+      </w:r>
+      <w:proofErr w:type="gramEnd"/>
+      <w:r>
+        <w:t xml:space="preserve"> a New Ticket</w:t>
       </w:r>
     </w:p>
     <w:p>
@@ -3389,14 +3571,29 @@
               <w:rPr>
                 <w:color w:val="707070"/>
               </w:rPr>
-              <w:t xml:space="preserve">1     </w:t>
-            </w:r>
-            <w:r>
-              <w:rPr>
-                <w:rFonts w:ascii="Consolas" w:eastAsia="Consolas" w:hAnsi="Consolas" w:cs="Consolas"/>
-                <w:color w:val="1F2328"/>
-              </w:rPr>
-              <w:t>(Not specified)</w:t>
+              <w:t xml:space="preserve">1  </w:t>
+            </w:r>
+            <w:proofErr w:type="gramStart"/>
+            <w:r>
+              <w:rPr>
+                <w:color w:val="707070"/>
+              </w:rPr>
+              <w:t xml:space="preserve">   </w:t>
+            </w:r>
+            <w:r>
+              <w:rPr>
+                <w:rFonts w:ascii="Consolas" w:eastAsia="Consolas" w:hAnsi="Consolas" w:cs="Consolas"/>
+                <w:color w:val="1F2328"/>
+              </w:rPr>
+              <w:t>(</w:t>
+            </w:r>
+            <w:proofErr w:type="gramEnd"/>
+            <w:r>
+              <w:rPr>
+                <w:rFonts w:ascii="Consolas" w:eastAsia="Consolas" w:hAnsi="Consolas" w:cs="Consolas"/>
+                <w:color w:val="1F2328"/>
+              </w:rPr>
+              <w:t>Not specified)</w:t>
             </w:r>
           </w:p>
           <w:p>
@@ -4296,8 +4493,13 @@
           <w:numId w:val="25"/>
         </w:numPr>
       </w:pPr>
-      <w:r>
-        <w:t>Creates a new user account</w:t>
+      <w:proofErr w:type="gramStart"/>
+      <w:r>
+        <w:t>Creates</w:t>
+      </w:r>
+      <w:proofErr w:type="gramEnd"/>
+      <w:r>
+        <w:t xml:space="preserve"> a new user account</w:t>
       </w:r>
     </w:p>
     <w:p>
@@ -4376,7 +4578,14 @@
               <w:rPr>
                 <w:color w:val="707070"/>
               </w:rPr>
-              <w:t xml:space="preserve">1     </w:t>
+              <w:t xml:space="preserve">1  </w:t>
+            </w:r>
+            <w:proofErr w:type="gramStart"/>
+            <w:r>
+              <w:rPr>
+                <w:color w:val="707070"/>
+              </w:rPr>
+              <w:t xml:space="preserve">   </w:t>
             </w:r>
             <w:r>
               <w:rPr>
@@ -4385,6 +4594,7 @@
               </w:rPr>
               <w:t>{</w:t>
             </w:r>
+            <w:proofErr w:type="gramEnd"/>
           </w:p>
           <w:p>
             <w:pPr>
@@ -4408,7 +4618,23 @@
                 <w:rFonts w:ascii="Consolas" w:eastAsia="Consolas" w:hAnsi="Consolas" w:cs="Consolas"/>
                 <w:color w:val="0A3069"/>
               </w:rPr>
-              <w:t>"username"</w:t>
+              <w:t>"</w:t>
+            </w:r>
+            <w:proofErr w:type="gramStart"/>
+            <w:r>
+              <w:rPr>
+                <w:rFonts w:ascii="Consolas" w:eastAsia="Consolas" w:hAnsi="Consolas" w:cs="Consolas"/>
+                <w:color w:val="0A3069"/>
+              </w:rPr>
+              <w:t>username</w:t>
+            </w:r>
+            <w:proofErr w:type="gramEnd"/>
+            <w:r>
+              <w:rPr>
+                <w:rFonts w:ascii="Consolas" w:eastAsia="Consolas" w:hAnsi="Consolas" w:cs="Consolas"/>
+                <w:color w:val="0A3069"/>
+              </w:rPr>
+              <w:t>"</w:t>
             </w:r>
             <w:r>
               <w:rPr>
@@ -4454,7 +4680,23 @@
                 <w:rFonts w:ascii="Consolas" w:eastAsia="Consolas" w:hAnsi="Consolas" w:cs="Consolas"/>
                 <w:color w:val="0A3069"/>
               </w:rPr>
-              <w:t>"password"</w:t>
+              <w:t>"</w:t>
+            </w:r>
+            <w:proofErr w:type="gramStart"/>
+            <w:r>
+              <w:rPr>
+                <w:rFonts w:ascii="Consolas" w:eastAsia="Consolas" w:hAnsi="Consolas" w:cs="Consolas"/>
+                <w:color w:val="0A3069"/>
+              </w:rPr>
+              <w:t>password</w:t>
+            </w:r>
+            <w:proofErr w:type="gramEnd"/>
+            <w:r>
+              <w:rPr>
+                <w:rFonts w:ascii="Consolas" w:eastAsia="Consolas" w:hAnsi="Consolas" w:cs="Consolas"/>
+                <w:color w:val="0A3069"/>
+              </w:rPr>
+              <w:t>"</w:t>
             </w:r>
             <w:r>
               <w:rPr>
@@ -4516,7 +4758,23 @@
                 <w:rFonts w:ascii="Consolas" w:eastAsia="Consolas" w:hAnsi="Consolas" w:cs="Consolas"/>
                 <w:color w:val="0A3069"/>
               </w:rPr>
-              <w:t>"role"</w:t>
+              <w:t>"</w:t>
+            </w:r>
+            <w:proofErr w:type="gramStart"/>
+            <w:r>
+              <w:rPr>
+                <w:rFonts w:ascii="Consolas" w:eastAsia="Consolas" w:hAnsi="Consolas" w:cs="Consolas"/>
+                <w:color w:val="0A3069"/>
+              </w:rPr>
+              <w:t>role</w:t>
+            </w:r>
+            <w:proofErr w:type="gramEnd"/>
+            <w:r>
+              <w:rPr>
+                <w:rFonts w:ascii="Consolas" w:eastAsia="Consolas" w:hAnsi="Consolas" w:cs="Consolas"/>
+                <w:color w:val="0A3069"/>
+              </w:rPr>
+              <w:t>"</w:t>
             </w:r>
             <w:r>
               <w:rPr>
@@ -4541,7 +4799,14 @@
               <w:rPr>
                 <w:color w:val="707070"/>
               </w:rPr>
-              <w:t xml:space="preserve">5     </w:t>
+              <w:t xml:space="preserve">5   </w:t>
+            </w:r>
+            <w:proofErr w:type="gramStart"/>
+            <w:r>
+              <w:rPr>
+                <w:color w:val="707070"/>
+              </w:rPr>
+              <w:t xml:space="preserve">  </w:t>
             </w:r>
             <w:r>
               <w:rPr>
@@ -4550,6 +4815,7 @@
               </w:rPr>
               <w:t>}</w:t>
             </w:r>
+            <w:proofErr w:type="gramEnd"/>
           </w:p>
           <w:p>
             <w:pPr>
@@ -5017,8 +5283,13 @@
           <w:numId w:val="29"/>
         </w:numPr>
       </w:pPr>
-      <w:r>
-        <w:t>Creates a new ticket purchase record</w:t>
+      <w:proofErr w:type="gramStart"/>
+      <w:r>
+        <w:t>Creates</w:t>
+      </w:r>
+      <w:proofErr w:type="gramEnd"/>
+      <w:r>
+        <w:t xml:space="preserve"> a new ticket purchase record</w:t>
       </w:r>
     </w:p>
     <w:p>
@@ -5114,7 +5385,14 @@
               <w:rPr>
                 <w:color w:val="707070"/>
               </w:rPr>
-              <w:t xml:space="preserve">1     </w:t>
+              <w:t xml:space="preserve">1  </w:t>
+            </w:r>
+            <w:proofErr w:type="gramStart"/>
+            <w:r>
+              <w:rPr>
+                <w:color w:val="707070"/>
+              </w:rPr>
+              <w:t xml:space="preserve">   </w:t>
             </w:r>
             <w:r>
               <w:rPr>
@@ -5123,6 +5401,7 @@
               </w:rPr>
               <w:t>{</w:t>
             </w:r>
+            <w:proofErr w:type="gramEnd"/>
           </w:p>
           <w:p>
             <w:pPr>
@@ -5311,7 +5590,14 @@
               <w:rPr>
                 <w:color w:val="707070"/>
               </w:rPr>
-              <w:t xml:space="preserve">5     </w:t>
+              <w:t xml:space="preserve">5   </w:t>
+            </w:r>
+            <w:proofErr w:type="gramStart"/>
+            <w:r>
+              <w:rPr>
+                <w:color w:val="707070"/>
+              </w:rPr>
+              <w:t xml:space="preserve">  </w:t>
             </w:r>
             <w:r>
               <w:rPr>
@@ -5320,6 +5606,7 @@
               </w:rPr>
               <w:t>}</w:t>
             </w:r>
+            <w:proofErr w:type="gramEnd"/>
           </w:p>
           <w:p>
             <w:pPr>
@@ -5771,69 +6058,669 @@
     </w:p>
     <w:p>
       <w:pPr>
-        <w:pStyle w:val="Heading3"/>
-      </w:pPr>
-      <w:r>
-        <w:t>Error Handling Behavior (Tickets Sold)</w:t>
-      </w:r>
-    </w:p>
-    <w:p>
-      <w:pPr>
-        <w:pStyle w:val="ListParagraph"/>
-        <w:numPr>
-          <w:ilvl w:val="0"/>
-          <w:numId w:val="32"/>
-        </w:numPr>
-      </w:pPr>
-      <w:r>
-        <w:t>Invalid request data returns HTTP 400 (Bad Request)</w:t>
-      </w:r>
-    </w:p>
-    <w:p>
-      <w:pPr>
-        <w:pStyle w:val="ListParagraph"/>
-        <w:numPr>
-          <w:ilvl w:val="0"/>
-          <w:numId w:val="32"/>
-        </w:numPr>
-      </w:pPr>
-      <w:r>
-        <w:t>Requesting a non-existent ticket sale ID returns HTTP 404 (Not Found)</w:t>
-      </w:r>
-    </w:p>
-    <w:p>
-      <w:pPr>
-        <w:pStyle w:val="ListParagraph"/>
-        <w:numPr>
-          <w:ilvl w:val="0"/>
-          <w:numId w:val="32"/>
-        </w:numPr>
-      </w:pPr>
-      <w:r>
-        <w:t xml:space="preserve">Invalid </w:t>
-      </w:r>
-      <w:proofErr w:type="spellStart"/>
-      <w:r>
-        <w:t>sortBy</w:t>
-      </w:r>
-      <w:proofErr w:type="spellEnd"/>
-      <w:r>
-        <w:t xml:space="preserve"> values do not crash the API and fall back to default sorting</w:t>
-      </w:r>
-    </w:p>
-    <w:p>
-      <w:pPr>
         <w:pBdr>
           <w:top w:val="single" w:sz="12" w:space="0" w:color="auto"/>
         </w:pBdr>
         <w:spacing w:after="0"/>
       </w:pPr>
+      <w:r>
+        <w:t>GET by user ID:</w:t>
+      </w:r>
+    </w:p>
+    <w:p>
+      <w:pPr>
+        <w:pBdr>
+          <w:top w:val="single" w:sz="12" w:space="0" w:color="auto"/>
+        </w:pBdr>
+        <w:spacing w:after="0"/>
+      </w:pPr>
+      <w:r>
+        <w:t xml:space="preserve">API: </w:t>
+      </w:r>
+    </w:p>
+    <w:p>
+      <w:pPr>
+        <w:pBdr>
+          <w:top w:val="single" w:sz="12" w:space="0" w:color="auto"/>
+        </w:pBdr>
+        <w:spacing w:after="0"/>
+      </w:pPr>
+      <w:r>
+        <w:t>http://localhost:8080/api/tickets-sold/user/3?page=0&amp;size=10&amp;sortBy=dateSold&amp;ascending=true</w:t>
+      </w:r>
+    </w:p>
+    <w:p>
+      <w:pPr>
+        <w:pBdr>
+          <w:top w:val="single" w:sz="12" w:space="0" w:color="auto"/>
+        </w:pBdr>
+        <w:spacing w:after="0"/>
+      </w:pPr>
+      <w:r>
+        <w:t>Result:</w:t>
+      </w:r>
+    </w:p>
+    <w:p>
+      <w:pPr>
+        <w:pBdr>
+          <w:top w:val="single" w:sz="12" w:space="0" w:color="auto"/>
+        </w:pBdr>
+        <w:spacing w:after="0"/>
+      </w:pPr>
+      <w:r>
+        <w:t>{</w:t>
+      </w:r>
+    </w:p>
+    <w:p>
+      <w:pPr>
+        <w:pBdr>
+          <w:top w:val="single" w:sz="12" w:space="0" w:color="auto"/>
+        </w:pBdr>
+        <w:spacing w:after="0"/>
+      </w:pPr>
+      <w:r>
+        <w:t xml:space="preserve">    "content": [</w:t>
+      </w:r>
+    </w:p>
+    <w:p>
+      <w:pPr>
+        <w:pBdr>
+          <w:top w:val="single" w:sz="12" w:space="0" w:color="auto"/>
+        </w:pBdr>
+        <w:spacing w:after="0"/>
+      </w:pPr>
+      <w:r>
+        <w:t xml:space="preserve">        {</w:t>
+      </w:r>
+    </w:p>
+    <w:p>
+      <w:pPr>
+        <w:pBdr>
+          <w:top w:val="single" w:sz="12" w:space="0" w:color="auto"/>
+        </w:pBdr>
+        <w:spacing w:after="0"/>
+      </w:pPr>
+      <w:r>
+        <w:t xml:space="preserve">            "id": 1,</w:t>
+      </w:r>
+    </w:p>
+    <w:p>
+      <w:pPr>
+        <w:pBdr>
+          <w:top w:val="single" w:sz="12" w:space="0" w:color="auto"/>
+        </w:pBdr>
+        <w:spacing w:after="0"/>
+      </w:pPr>
+      <w:r>
+        <w:t xml:space="preserve">            "</w:t>
+      </w:r>
+      <w:proofErr w:type="spellStart"/>
+      <w:r>
+        <w:t>userId</w:t>
+      </w:r>
+      <w:proofErr w:type="spellEnd"/>
+      <w:r>
+        <w:t>": 3,</w:t>
+      </w:r>
+    </w:p>
+    <w:p>
+      <w:pPr>
+        <w:pBdr>
+          <w:top w:val="single" w:sz="12" w:space="0" w:color="auto"/>
+        </w:pBdr>
+        <w:spacing w:after="0"/>
+      </w:pPr>
+      <w:r>
+        <w:t xml:space="preserve">            "</w:t>
+      </w:r>
+      <w:proofErr w:type="spellStart"/>
+      <w:r>
+        <w:t>ticketId</w:t>
+      </w:r>
+      <w:proofErr w:type="spellEnd"/>
+      <w:r>
+        <w:t>": 735,</w:t>
+      </w:r>
+    </w:p>
+    <w:p>
+      <w:pPr>
+        <w:pBdr>
+          <w:top w:val="single" w:sz="12" w:space="0" w:color="auto"/>
+        </w:pBdr>
+        <w:spacing w:after="0"/>
+      </w:pPr>
+      <w:r>
+        <w:t xml:space="preserve">            "</w:t>
+      </w:r>
+      <w:proofErr w:type="spellStart"/>
+      <w:r>
+        <w:t>dateSold</w:t>
+      </w:r>
+      <w:proofErr w:type="spellEnd"/>
+      <w:r>
+        <w:t>": "2007-05-31"</w:t>
+      </w:r>
+    </w:p>
+    <w:p>
+      <w:pPr>
+        <w:pBdr>
+          <w:top w:val="single" w:sz="12" w:space="0" w:color="auto"/>
+        </w:pBdr>
+        <w:spacing w:after="0"/>
+      </w:pPr>
+      <w:r>
+        <w:t xml:space="preserve">        },</w:t>
+      </w:r>
+    </w:p>
+    <w:p>
+      <w:pPr>
+        <w:pBdr>
+          <w:top w:val="single" w:sz="12" w:space="0" w:color="auto"/>
+        </w:pBdr>
+        <w:spacing w:after="0"/>
+      </w:pPr>
+      <w:r>
+        <w:t xml:space="preserve">        {</w:t>
+      </w:r>
+    </w:p>
+    <w:p>
+      <w:pPr>
+        <w:pBdr>
+          <w:top w:val="single" w:sz="12" w:space="0" w:color="auto"/>
+        </w:pBdr>
+        <w:spacing w:after="0"/>
+      </w:pPr>
+      <w:r>
+        <w:lastRenderedPageBreak/>
+        <w:t xml:space="preserve">            "id": 2,</w:t>
+      </w:r>
+    </w:p>
+    <w:p>
+      <w:pPr>
+        <w:pBdr>
+          <w:top w:val="single" w:sz="12" w:space="0" w:color="auto"/>
+        </w:pBdr>
+        <w:spacing w:after="0"/>
+      </w:pPr>
+      <w:r>
+        <w:t xml:space="preserve">            "</w:t>
+      </w:r>
+      <w:proofErr w:type="spellStart"/>
+      <w:r>
+        <w:t>userId</w:t>
+      </w:r>
+      <w:proofErr w:type="spellEnd"/>
+      <w:r>
+        <w:t>": 3,</w:t>
+      </w:r>
+    </w:p>
+    <w:p>
+      <w:pPr>
+        <w:pBdr>
+          <w:top w:val="single" w:sz="12" w:space="0" w:color="auto"/>
+        </w:pBdr>
+        <w:spacing w:after="0"/>
+      </w:pPr>
+      <w:r>
+        <w:t xml:space="preserve">            "</w:t>
+      </w:r>
+      <w:proofErr w:type="spellStart"/>
+      <w:r>
+        <w:t>ticketId</w:t>
+      </w:r>
+      <w:proofErr w:type="spellEnd"/>
+      <w:r>
+        <w:t>": 736,</w:t>
+      </w:r>
+    </w:p>
+    <w:p>
+      <w:pPr>
+        <w:pBdr>
+          <w:top w:val="single" w:sz="12" w:space="0" w:color="auto"/>
+        </w:pBdr>
+        <w:spacing w:after="0"/>
+      </w:pPr>
+      <w:r>
+        <w:t xml:space="preserve">            "</w:t>
+      </w:r>
+      <w:proofErr w:type="spellStart"/>
+      <w:r>
+        <w:t>dateSold</w:t>
+      </w:r>
+      <w:proofErr w:type="spellEnd"/>
+      <w:r>
+        <w:t>": "2007-06-01"</w:t>
+      </w:r>
+    </w:p>
+    <w:p>
+      <w:pPr>
+        <w:pBdr>
+          <w:top w:val="single" w:sz="12" w:space="0" w:color="auto"/>
+        </w:pBdr>
+        <w:spacing w:after="0"/>
+      </w:pPr>
+      <w:r>
+        <w:t xml:space="preserve">        }</w:t>
+      </w:r>
+    </w:p>
+    <w:p>
+      <w:pPr>
+        <w:pBdr>
+          <w:top w:val="single" w:sz="12" w:space="0" w:color="auto"/>
+        </w:pBdr>
+        <w:spacing w:after="0"/>
+      </w:pPr>
+      <w:r>
+        <w:t xml:space="preserve">    ],</w:t>
+      </w:r>
+    </w:p>
+    <w:p>
+      <w:pPr>
+        <w:pBdr>
+          <w:top w:val="single" w:sz="12" w:space="0" w:color="auto"/>
+        </w:pBdr>
+        <w:spacing w:after="0"/>
+      </w:pPr>
+      <w:r>
+        <w:t xml:space="preserve">    "empty": false,</w:t>
+      </w:r>
+    </w:p>
+    <w:p>
+      <w:pPr>
+        <w:pBdr>
+          <w:top w:val="single" w:sz="12" w:space="0" w:color="auto"/>
+        </w:pBdr>
+        <w:spacing w:after="0"/>
+      </w:pPr>
+      <w:r>
+        <w:t xml:space="preserve">    "first": true,</w:t>
+      </w:r>
+    </w:p>
+    <w:p>
+      <w:pPr>
+        <w:pBdr>
+          <w:top w:val="single" w:sz="12" w:space="0" w:color="auto"/>
+        </w:pBdr>
+        <w:spacing w:after="0"/>
+      </w:pPr>
+      <w:r>
+        <w:t xml:space="preserve">    "last": false,</w:t>
+      </w:r>
+    </w:p>
+    <w:p>
+      <w:pPr>
+        <w:pBdr>
+          <w:top w:val="single" w:sz="12" w:space="0" w:color="auto"/>
+        </w:pBdr>
+        <w:spacing w:after="0"/>
+      </w:pPr>
+      <w:r>
+        <w:t xml:space="preserve">    "number": 0,</w:t>
+      </w:r>
+    </w:p>
+    <w:p>
+      <w:pPr>
+        <w:pBdr>
+          <w:top w:val="single" w:sz="12" w:space="0" w:color="auto"/>
+        </w:pBdr>
+        <w:spacing w:after="0"/>
+      </w:pPr>
+      <w:r>
+        <w:t xml:space="preserve">    "</w:t>
+      </w:r>
+      <w:proofErr w:type="spellStart"/>
+      <w:r>
+        <w:t>numberOfElements</w:t>
+      </w:r>
+      <w:proofErr w:type="spellEnd"/>
+      <w:r>
+        <w:t>": 2,</w:t>
+      </w:r>
+    </w:p>
+    <w:p>
+      <w:pPr>
+        <w:pBdr>
+          <w:top w:val="single" w:sz="12" w:space="0" w:color="auto"/>
+        </w:pBdr>
+        <w:spacing w:after="0"/>
+      </w:pPr>
+      <w:r>
+        <w:t xml:space="preserve">    "pageable</w:t>
+      </w:r>
+      <w:proofErr w:type="gramStart"/>
+      <w:r>
+        <w:t>": {</w:t>
+      </w:r>
+      <w:proofErr w:type="gramEnd"/>
+    </w:p>
+    <w:p>
+      <w:pPr>
+        <w:pBdr>
+          <w:top w:val="single" w:sz="12" w:space="0" w:color="auto"/>
+        </w:pBdr>
+        <w:spacing w:after="0"/>
+      </w:pPr>
+      <w:r>
+        <w:t xml:space="preserve">        "offset": 0,</w:t>
+      </w:r>
+    </w:p>
+    <w:p>
+      <w:pPr>
+        <w:pBdr>
+          <w:top w:val="single" w:sz="12" w:space="0" w:color="auto"/>
+        </w:pBdr>
+        <w:spacing w:after="0"/>
+      </w:pPr>
+      <w:r>
+        <w:t xml:space="preserve">        "</w:t>
+      </w:r>
+      <w:proofErr w:type="spellStart"/>
+      <w:r>
+        <w:t>pageNumber</w:t>
+      </w:r>
+      <w:proofErr w:type="spellEnd"/>
+      <w:r>
+        <w:t>": 0,</w:t>
+      </w:r>
+    </w:p>
+    <w:p>
+      <w:pPr>
+        <w:pBdr>
+          <w:top w:val="single" w:sz="12" w:space="0" w:color="auto"/>
+        </w:pBdr>
+        <w:spacing w:after="0"/>
+      </w:pPr>
+      <w:r>
+        <w:t xml:space="preserve">        "</w:t>
+      </w:r>
+      <w:proofErr w:type="spellStart"/>
+      <w:r>
+        <w:t>pageSize</w:t>
+      </w:r>
+      <w:proofErr w:type="spellEnd"/>
+      <w:r>
+        <w:t>": 10,</w:t>
+      </w:r>
+    </w:p>
+    <w:p>
+      <w:pPr>
+        <w:pBdr>
+          <w:top w:val="single" w:sz="12" w:space="0" w:color="auto"/>
+        </w:pBdr>
+        <w:spacing w:after="0"/>
+      </w:pPr>
+      <w:r>
+        <w:t xml:space="preserve">        "paged": true,</w:t>
+      </w:r>
+    </w:p>
+    <w:p>
+      <w:pPr>
+        <w:pBdr>
+          <w:top w:val="single" w:sz="12" w:space="0" w:color="auto"/>
+        </w:pBdr>
+        <w:spacing w:after="0"/>
+      </w:pPr>
+      <w:r>
+        <w:t xml:space="preserve">        "sort</w:t>
+      </w:r>
+      <w:proofErr w:type="gramStart"/>
+      <w:r>
+        <w:t>": {</w:t>
+      </w:r>
+      <w:proofErr w:type="gramEnd"/>
+    </w:p>
+    <w:p>
+      <w:pPr>
+        <w:pBdr>
+          <w:top w:val="single" w:sz="12" w:space="0" w:color="auto"/>
+        </w:pBdr>
+        <w:spacing w:after="0"/>
+      </w:pPr>
+      <w:r>
+        <w:t xml:space="preserve">            "empty": false,</w:t>
+      </w:r>
+    </w:p>
+    <w:p>
+      <w:pPr>
+        <w:pBdr>
+          <w:top w:val="single" w:sz="12" w:space="0" w:color="auto"/>
+        </w:pBdr>
+        <w:spacing w:after="0"/>
+      </w:pPr>
+      <w:r>
+        <w:t xml:space="preserve">            "sorted": true,</w:t>
+      </w:r>
+    </w:p>
+    <w:p>
+      <w:pPr>
+        <w:pBdr>
+          <w:top w:val="single" w:sz="12" w:space="0" w:color="auto"/>
+        </w:pBdr>
+        <w:spacing w:after="0"/>
+      </w:pPr>
+      <w:r>
+        <w:t xml:space="preserve">            "unsorted": false</w:t>
+      </w:r>
+    </w:p>
+    <w:p>
+      <w:pPr>
+        <w:pBdr>
+          <w:top w:val="single" w:sz="12" w:space="0" w:color="auto"/>
+        </w:pBdr>
+        <w:spacing w:after="0"/>
+      </w:pPr>
+      <w:r>
+        <w:t xml:space="preserve">        },</w:t>
+      </w:r>
+    </w:p>
+    <w:p>
+      <w:pPr>
+        <w:pBdr>
+          <w:top w:val="single" w:sz="12" w:space="0" w:color="auto"/>
+        </w:pBdr>
+        <w:spacing w:after="0"/>
+      </w:pPr>
+      <w:r>
+        <w:t xml:space="preserve">        "unpaged": false</w:t>
+      </w:r>
+    </w:p>
+    <w:p>
+      <w:pPr>
+        <w:pBdr>
+          <w:top w:val="single" w:sz="12" w:space="0" w:color="auto"/>
+        </w:pBdr>
+        <w:spacing w:after="0"/>
+      </w:pPr>
+      <w:r>
+        <w:t xml:space="preserve">    },</w:t>
+      </w:r>
+    </w:p>
+    <w:p>
+      <w:pPr>
+        <w:pBdr>
+          <w:top w:val="single" w:sz="12" w:space="0" w:color="auto"/>
+        </w:pBdr>
+        <w:spacing w:after="0"/>
+      </w:pPr>
+      <w:r>
+        <w:t xml:space="preserve">    "size": 10,</w:t>
+      </w:r>
+    </w:p>
+    <w:p>
+      <w:pPr>
+        <w:pBdr>
+          <w:top w:val="single" w:sz="12" w:space="0" w:color="auto"/>
+        </w:pBdr>
+        <w:spacing w:after="0"/>
+      </w:pPr>
+      <w:r>
+        <w:t xml:space="preserve">    "sort</w:t>
+      </w:r>
+      <w:proofErr w:type="gramStart"/>
+      <w:r>
+        <w:t>": {</w:t>
+      </w:r>
+      <w:proofErr w:type="gramEnd"/>
+    </w:p>
+    <w:p>
+      <w:pPr>
+        <w:pBdr>
+          <w:top w:val="single" w:sz="12" w:space="0" w:color="auto"/>
+        </w:pBdr>
+        <w:spacing w:after="0"/>
+      </w:pPr>
+      <w:r>
+        <w:t xml:space="preserve">        "empty": false,</w:t>
+      </w:r>
+    </w:p>
+    <w:p>
+      <w:pPr>
+        <w:pBdr>
+          <w:top w:val="single" w:sz="12" w:space="0" w:color="auto"/>
+        </w:pBdr>
+        <w:spacing w:after="0"/>
+      </w:pPr>
+      <w:r>
+        <w:t xml:space="preserve">        "sorted": true,</w:t>
+      </w:r>
+    </w:p>
+    <w:p>
+      <w:pPr>
+        <w:pBdr>
+          <w:top w:val="single" w:sz="12" w:space="0" w:color="auto"/>
+        </w:pBdr>
+        <w:spacing w:after="0"/>
+      </w:pPr>
+      <w:r>
+        <w:t xml:space="preserve">        "unsorted": false</w:t>
+      </w:r>
+    </w:p>
+    <w:p>
+      <w:pPr>
+        <w:pBdr>
+          <w:top w:val="single" w:sz="12" w:space="0" w:color="auto"/>
+        </w:pBdr>
+        <w:spacing w:after="0"/>
+      </w:pPr>
+      <w:r>
+        <w:t xml:space="preserve">    },</w:t>
+      </w:r>
+    </w:p>
+    <w:p>
+      <w:pPr>
+        <w:pBdr>
+          <w:top w:val="single" w:sz="12" w:space="0" w:color="auto"/>
+        </w:pBdr>
+        <w:spacing w:after="0"/>
+      </w:pPr>
+      <w:r>
+        <w:t xml:space="preserve">    "</w:t>
+      </w:r>
+      <w:proofErr w:type="spellStart"/>
+      <w:r>
+        <w:t>totalElements</w:t>
+      </w:r>
+      <w:proofErr w:type="spellEnd"/>
+      <w:r>
+        <w:t>": 15,</w:t>
+      </w:r>
+    </w:p>
+    <w:p>
+      <w:pPr>
+        <w:pBdr>
+          <w:top w:val="single" w:sz="12" w:space="0" w:color="auto"/>
+        </w:pBdr>
+        <w:spacing w:after="0"/>
+      </w:pPr>
+      <w:r>
+        <w:t xml:space="preserve">    "</w:t>
+      </w:r>
+      <w:proofErr w:type="spellStart"/>
+      <w:r>
+        <w:t>totalPages</w:t>
+      </w:r>
+      <w:proofErr w:type="spellEnd"/>
+      <w:r>
+        <w:t>": 2</w:t>
+      </w:r>
+    </w:p>
+    <w:p>
+      <w:pPr>
+        <w:pBdr>
+          <w:top w:val="single" w:sz="12" w:space="0" w:color="auto"/>
+        </w:pBdr>
+        <w:spacing w:after="0"/>
+      </w:pPr>
+      <w:r>
+        <w:t>}</w:t>
+      </w:r>
     </w:p>
     <w:p>
       <w:pPr>
         <w:pStyle w:val="Heading3"/>
       </w:pPr>
       <w:r>
+        <w:t>Error Handling Behavior (Tickets Sold)</w:t>
+      </w:r>
+    </w:p>
+    <w:p>
+      <w:pPr>
+        <w:pStyle w:val="ListParagraph"/>
+        <w:numPr>
+          <w:ilvl w:val="0"/>
+          <w:numId w:val="32"/>
+        </w:numPr>
+      </w:pPr>
+      <w:r>
+        <w:t>Invalid request data returns HTTP 400 (Bad Request)</w:t>
+      </w:r>
+    </w:p>
+    <w:p>
+      <w:pPr>
+        <w:pStyle w:val="ListParagraph"/>
+        <w:numPr>
+          <w:ilvl w:val="0"/>
+          <w:numId w:val="32"/>
+        </w:numPr>
+      </w:pPr>
+      <w:r>
+        <w:t>Requesting a non-existent ticket sale ID returns HTTP 404 (Not Found)</w:t>
+      </w:r>
+    </w:p>
+    <w:p>
+      <w:pPr>
+        <w:pStyle w:val="ListParagraph"/>
+        <w:numPr>
+          <w:ilvl w:val="0"/>
+          <w:numId w:val="32"/>
+        </w:numPr>
+      </w:pPr>
+      <w:r>
+        <w:t xml:space="preserve">Invalid </w:t>
+      </w:r>
+      <w:proofErr w:type="spellStart"/>
+      <w:r>
+        <w:t>sortBy</w:t>
+      </w:r>
+      <w:proofErr w:type="spellEnd"/>
+      <w:r>
+        <w:t xml:space="preserve"> values do not crash the API and fall back to default sorting</w:t>
+      </w:r>
+    </w:p>
+    <w:p>
+      <w:pPr>
+        <w:pBdr>
+          <w:top w:val="single" w:sz="12" w:space="0" w:color="auto"/>
+        </w:pBdr>
+        <w:spacing w:after="0"/>
+      </w:pPr>
+    </w:p>
+    <w:p>
+      <w:pPr>
+        <w:pStyle w:val="Heading3"/>
+      </w:pPr>
+      <w:r>
+        <w:lastRenderedPageBreak/>
         <w:t>Notes (Tickets Sold)</w:t>
       </w:r>
     </w:p>
@@ -10298,6 +11185,7 @@
   <w:style w:type="character" w:default="1" w:styleId="DefaultParagraphFont">
     <w:name w:val="Default Paragraph Font"/>
     <w:uiPriority w:val="1"/>
+    <w:semiHidden/>
     <w:unhideWhenUsed/>
   </w:style>
   <w:style w:type="table" w:default="1" w:styleId="TableNormal">

</xml_diff>